<commit_message>
docs: update partial project report content
</commit_message>
<xml_diff>
--- a/docx/relatorio_parcial.docx
+++ b/docx/relatorio_parcial.docx
@@ -964,7 +964,7 @@
           <w:sz w:val="24"/>
           <w:szCs w:val="24"/>
         </w:rPr>
-        <w:t xml:space="preserve">O Vector Space Model (VSM), originalmente proposto por Salton e colaboradores, representa documentos e consultas como vetores em um espaço multidimensional, onde cada dimensão corresponde a um termo do vocabulário. A relevância de um documento para uma consulta é estimada pela proximidade angular entre os vetores, tipicamente medida pela similaridade de cosseno. Em sua formulação clássica, os pesos das dimensões são calculados com esquemas como TF-IDF (term frequency–inverse document frequency), que combinam a frequência local de um termo com sua raridade no corpus (Paiva, 2014).</w:t>
+        <w:t xml:space="preserve">O Vector Space Model (VSM), originalmente proposto por Salton, Wong e Yang (1975), representa documentos e consultas como vetores em um espaço multidimensional, onde cada dimensão corresponde a um termo do vocabulário. A relevância de um documento para uma consulta é estimada pela proximidade angular entre os vetores, tipicamente medida pela similaridade de cosseno. Em sua formulação clássica, os pesos das dimensões são calculados com esquemas como TF-IDF (term frequency–inverse document frequency), que combinam a frequência local de um termo com sua raridade no corpus (Paiva, 2014).</w:t>
       </w:r>
     </w:p>
     <w:p>
@@ -1008,7 +1008,7 @@
           <w:sz w:val="22"/>
           <w:szCs w:val="22"/>
         </w:rPr>
-        <w:t xml:space="preserve">Expandir esta subseção com a descrição formal de TF-IDF, similaridade de cosseno e limitações do VSM clássico (sinonímia, polissemia, vocabulary mismatch). Adicionar referência a Salton et al. (1975) como fonte primária.</w:t>
+        <w:t xml:space="preserve">Expandir esta subseção com a descrição formal de TF-IDF, similaridade de cosseno e limitações do VSM clássico (sinonímia, polissemia, vocabulary mismatch).</w:t>
       </w:r>
     </w:p>
     <w:p>
@@ -1196,6 +1196,20 @@
           <w:sz w:val="24"/>
           <w:szCs w:val="24"/>
         </w:rPr>
+        <w:t xml:space="preserve">A combinação de busca vetorial com filtros estruturados — central ao Cenário B deste estudo — é um eixo no qual os três sistemas adotam estratégias distintas, tipicamente classificadas como pré-filtragem, pós-filtragem e filtragem inline durante a navegação no grafo HNSW. Patel et al. (2024) sistematizam o trade-off entre essas estratégias e demonstram, com a proposta ACORN, ganhos expressivos de throughput sob recall fixo quando a filtragem é integrada ao percurso do índice. Essa caracterização fornece base para interpretar diferenças observadas entre pgvector, Qdrant e Weaviate quando consultas vetoriais são combinadas com predicados sobre metadados.</w:t>
+      </w:r>
+    </w:p>
+    <w:p>
+      <w:pPr>
+        <w:spacing w:after="200" w:before="0" w:line="360"/>
+        <w:jc w:val="both"/>
+      </w:pPr>
+      <w:r>
+        <w:rPr>
+          <w:rFonts w:ascii="Arial" w:cs="Arial" w:eastAsia="Arial" w:hAnsi="Arial"/>
+          <w:sz w:val="24"/>
+          <w:szCs w:val="24"/>
+        </w:rPr>
         <w:t xml:space="preserve">A decisão entre uma solução integrada e uma especializada envolve um trade-off explícito: a primeira reduz a complexidade de stack ao custo de potencial perda de desempenho em cargas vetoriais intensivas; a segunda otimiza para o caso vetorial mas exige operar um sistema adicional, com seu próprio modelo de dados, ferramental e perfil operacional. Caracterizar esse trade-off de forma quantitativa, em cenários representativos, é o objetivo central deste estudo.</w:t>
       </w:r>
     </w:p>
@@ -1226,7 +1240,7 @@
           <w:sz w:val="24"/>
           <w:szCs w:val="24"/>
         </w:rPr>
-        <w:t xml:space="preserve">Sistemas Retrieval-Augmented Generation combinam um modelo de linguagem com um mecanismo de recuperação de informação para gerar respostas fundamentadas em uma base documental externa. O fluxo típico converte a consulta do usuário em um embedding, recupera do banco vetorial os trechos de documento mais similares e injeta esse contexto na chamada ao LLM, que gera a resposta final. Essa arquitetura permite que o modelo acesse conhecimento atualizado ou específico de domínio sem necessidade de retreinamento, reduzindo alucinações e aumentando a precisão factual (Jing et al., 2024).</w:t>
+        <w:t xml:space="preserve">Sistemas Retrieval-Augmented Generation, propostos por Lewis et al. (2020), combinam um modelo de linguagem com um mecanismo de recuperação de informação para gerar respostas fundamentadas em uma base documental externa. O fluxo típico converte a consulta do usuário em um embedding, recupera do banco vetorial os trechos de documento mais similares e injeta esse contexto na chamada ao LLM, que gera a resposta final. Essa arquitetura permite que o modelo acesse conhecimento atualizado ou específico de domínio sem necessidade de retreinamento, reduzindo alucinações e aumentando a precisão factual (Jing et al., 2024).</w:t>
       </w:r>
     </w:p>
     <w:p>
@@ -3852,7 +3866,7 @@
           <w:sz w:val="22"/>
           <w:szCs w:val="22"/>
         </w:rPr>
-        <w:t xml:space="preserve">MALKOV, Y. A.; YASHUNIN, D. A. Efficient and robust approximate nearest neighbor search using Hierarchical Navigable Small World graphs. IEEE Transactions on Pattern Analysis and Machine Intelligence, 2018.</w:t>
+        <w:t xml:space="preserve">LEWIS, P. et al. Retrieval-augmented generation for knowledge-intensive NLP tasks. In: Advances in Neural Information Processing Systems 33 (NeurIPS 2020), 2020. p. 9459–9474.</w:t>
       </w:r>
     </w:p>
     <w:p>
@@ -3867,7 +3881,7 @@
           <w:sz w:val="22"/>
           <w:szCs w:val="22"/>
         </w:rPr>
-        <w:t xml:space="preserve">PAIVA, L. M. S. S. Semantic relations extraction in unstructured information for domain ontologies enrichment. 2014. Dissertação de Mestrado, Universidade Nova de Lisboa, Lisboa, 2014.</w:t>
+        <w:t xml:space="preserve">MALKOV, Y. A.; YASHUNIN, D. A. Efficient and robust approximate nearest neighbor search using Hierarchical Navigable Small World graphs. IEEE Transactions on Pattern Analysis and Machine Intelligence, 2018.</w:t>
       </w:r>
     </w:p>
     <w:p>
@@ -3882,7 +3896,7 @@
           <w:sz w:val="22"/>
           <w:szCs w:val="22"/>
         </w:rPr>
-        <w:t xml:space="preserve">PAN, J.; WANG, J.; LI, G. Survey of Vector Database Management Systems. arXiv (Cornell University), 2023.</w:t>
+        <w:t xml:space="preserve">PAIVA, L. M. S. S. Semantic relations extraction in unstructured information for domain ontologies enrichment. 2014. Dissertação de Mestrado, Universidade Nova de Lisboa, Lisboa, 2014.</w:t>
       </w:r>
     </w:p>
     <w:p>
@@ -3897,7 +3911,7 @@
           <w:sz w:val="22"/>
           <w:szCs w:val="22"/>
         </w:rPr>
-        <w:t xml:space="preserve">PAWLIK, L. LLM Selection and Vector Database Tuning: A Methodology for Enhancing RAG Systems. Applied Sciences, v. 15, n. 20, p. 10886, 2025.</w:t>
+        <w:t xml:space="preserve">PAN, J.; WANG, J.; LI, G. Survey of Vector Database Management Systems. arXiv (Cornell University), 2023.</w:t>
       </w:r>
     </w:p>
     <w:p>
@@ -3912,7 +3926,7 @@
           <w:sz w:val="22"/>
           <w:szCs w:val="22"/>
         </w:rPr>
-        <w:t xml:space="preserve">REIMERS, N.; GUREVYCH, I. Sentence-BERT: Sentence embeddings using Siamese BERT-networks. In: Proceedings of the 2019 Conference on Empirical Methods in Natural Language Processing (EMNLP), 2019.</w:t>
+        <w:t xml:space="preserve">PATEL, L.; KRAFT, P.; GUESTRIN, C.; ZAHARIA, M. ACORN: performant and predicate-agnostic search over vector embeddings and structured data. Proceedings of the ACM on Management of Data (PACMMOD), v. 2, n. 3, art. 120, p. 1–27, 2024.</w:t>
       </w:r>
     </w:p>
     <w:p>
@@ -3927,7 +3941,37 @@
           <w:sz w:val="22"/>
           <w:szCs w:val="22"/>
         </w:rPr>
-        <w:t xml:space="preserve">SANTANA. Junções por similaridade aproximadas em espaços vetoriais densos. Disponível em: http://repositorio.bc.ufg.br/tede/handle/tede/13058. Acesso em: 3 dez. 2025.</w:t>
+        <w:t xml:space="preserve">PAWLIK, L. LLM Selection and Vector Database Tuning: A Methodology for Enhancing RAG Systems. Applied Sciences, v. 15, n. 20, p. 10886, 2025.</w:t>
+      </w:r>
+    </w:p>
+    <w:p>
+      <w:pPr>
+        <w:spacing w:after="200" w:line="300"/>
+        <w:ind w:left="0" w:hanging="0"/>
+        <w:jc w:val="both"/>
+      </w:pPr>
+      <w:r>
+        <w:rPr>
+          <w:rFonts w:ascii="Arial" w:cs="Arial" w:eastAsia="Arial" w:hAnsi="Arial"/>
+          <w:sz w:val="22"/>
+          <w:szCs w:val="22"/>
+        </w:rPr>
+        <w:t xml:space="preserve">REIMERS, N.; GUREVYCH, I. Sentence-BERT: Sentence embeddings using Siamese BERT-networks. In: Proceedings of the 2019 Conference on Empirical Methods in Natural Language Processing (EMNLP), 2019.</w:t>
+      </w:r>
+    </w:p>
+    <w:p>
+      <w:pPr>
+        <w:spacing w:after="200" w:line="300"/>
+        <w:ind w:left="0" w:hanging="0"/>
+        <w:jc w:val="both"/>
+      </w:pPr>
+      <w:r>
+        <w:rPr>
+          <w:rFonts w:ascii="Arial" w:cs="Arial" w:eastAsia="Arial" w:hAnsi="Arial"/>
+          <w:sz w:val="22"/>
+          <w:szCs w:val="22"/>
+        </w:rPr>
+        <w:t xml:space="preserve">SALTON, G.; WONG, A.; YANG, C. S. A vector space model for automatic indexing. Communications of the ACM, v. 18, n. 11, p. 613–620, 1975.</w:t>
       </w:r>
     </w:p>
     <w:p>
@@ -3957,7 +4001,7 @@
           <w:sz w:val="22"/>
           <w:szCs w:val="22"/>
         </w:rPr>
-        <w:t xml:space="preserve">Para o relatório final, expandir bibliografia até ~20 referências. Candidatos: Lewis et al. (2020) — RAG; Mikolov et al. (2013) — Word2Vec; Pennington et al. (2014) — GloVe; Muennighoff et al. (2023) — MTEB; Thakur et al. (2021) — BEIR; Salton et al. (1975) — VSM original; estudos comparativos recentes pgvector × especializados (2024–2025); referência sobre IVF/PQ. Considerar também o estudo de Santana já presente nas referências mas não citado no texto.</w:t>
+        <w:t xml:space="preserve">Para o relatório final, expandir bibliografia até ~20 referências. Candidatos: Mikolov et al. (2013) — Word2Vec; Pennington et al. (2014) — GloVe; Muennighoff et al. (2023) — MTEB; Thakur et al. (2021) — BEIR; Gao et al. (2024) — RAG survey; Wang et al. (2021) — Milvus; Guo et al. (2022) — Manu; Subramanya et al. (2019) — DiskANN; Douze et al. (2024) — Faiss; Jégou et al. (2011) — Product Quantization; estudos comparativos recentes pgvector × especializados (2024–2025).</w:t>
       </w:r>
     </w:p>
     <w:sectPr>

</xml_diff>

<commit_message>
feat: establish agent/skill system architecture with standardized task templates and GitHub Actions optimization references.
</commit_message>
<xml_diff>
--- a/docx/relatorio_parcial.docx
+++ b/docx/relatorio_parcial.docx
@@ -2206,7 +2206,7 @@
           <w:sz w:val="24"/>
           <w:szCs w:val="24"/>
         </w:rPr>
-        <w:t xml:space="preserve">O cronograma a seguir reflete o plano comprimido adotado a partir do início efetivo do projeto, com ajustes em relação ao planejamento original para acomodar a janela real de execução.</w:t>
+        <w:t xml:space="preserve">O cronograma a seguir distribui as cinco etapas do projeto ao longo do período de execução, conforme o planejamento original.</w:t>
       </w:r>
     </w:p>
     <w:p>
@@ -2374,15 +2374,19 @@
         </w:tblBorders>
       </w:tblPr>
       <w:tblGrid>
-        <w:gridCol w:w="1071"/>
-        <w:gridCol w:w="1000"/>
-        <w:gridCol w:w="1000"/>
-        <w:gridCol w:w="1000"/>
-        <w:gridCol w:w="1000"/>
-        <w:gridCol w:w="1000"/>
-        <w:gridCol w:w="1000"/>
-        <w:gridCol w:w="1000"/>
-        <w:gridCol w:w="1000"/>
+        <w:gridCol w:w="911"/>
+        <w:gridCol w:w="680"/>
+        <w:gridCol w:w="680"/>
+        <w:gridCol w:w="680"/>
+        <w:gridCol w:w="680"/>
+        <w:gridCol w:w="680"/>
+        <w:gridCol w:w="680"/>
+        <w:gridCol w:w="680"/>
+        <w:gridCol w:w="680"/>
+        <w:gridCol w:w="680"/>
+        <w:gridCol w:w="680"/>
+        <w:gridCol w:w="680"/>
+        <w:gridCol w:w="680"/>
       </w:tblGrid>
       <w:tr>
         <w:trPr>
@@ -2390,7 +2394,7 @@
         </w:trPr>
         <w:tc>
           <w:tcPr>
-            <w:tcW w:type="dxa" w:w="1071"/>
+            <w:tcW w:type="dxa" w:w="911"/>
             <w:shd w:fill="D9E1F2" w:val="clear"/>
             <w:tcMar>
               <w:top w:type="dxa" w:w="80"/>
@@ -2417,7 +2421,7 @@
         </w:tc>
         <w:tc>
           <w:tcPr>
-            <w:tcW w:type="dxa" w:w="1000"/>
+            <w:tcW w:type="dxa" w:w="680"/>
             <w:shd w:fill="D9E1F2" w:val="clear"/>
             <w:tcMar>
               <w:top w:type="dxa" w:w="80"/>
@@ -2438,13 +2442,13 @@
                 <w:sz w:val="22"/>
                 <w:szCs w:val="22"/>
               </w:rPr>
-              <w:t xml:space="preserve">Mai</w:t>
-            </w:r>
-          </w:p>
-        </w:tc>
-        <w:tc>
-          <w:tcPr>
-            <w:tcW w:type="dxa" w:w="1000"/>
+              <w:t xml:space="preserve">Jan</w:t>
+            </w:r>
+          </w:p>
+        </w:tc>
+        <w:tc>
+          <w:tcPr>
+            <w:tcW w:type="dxa" w:w="680"/>
             <w:shd w:fill="D9E1F2" w:val="clear"/>
             <w:tcMar>
               <w:top w:type="dxa" w:w="80"/>
@@ -2465,13 +2469,13 @@
                 <w:sz w:val="22"/>
                 <w:szCs w:val="22"/>
               </w:rPr>
-              <w:t xml:space="preserve">Jun</w:t>
-            </w:r>
-          </w:p>
-        </w:tc>
-        <w:tc>
-          <w:tcPr>
-            <w:tcW w:type="dxa" w:w="1000"/>
+              <w:t xml:space="preserve">Fev</w:t>
+            </w:r>
+          </w:p>
+        </w:tc>
+        <w:tc>
+          <w:tcPr>
+            <w:tcW w:type="dxa" w:w="680"/>
             <w:shd w:fill="D9E1F2" w:val="clear"/>
             <w:tcMar>
               <w:top w:type="dxa" w:w="80"/>
@@ -2492,13 +2496,13 @@
                 <w:sz w:val="22"/>
                 <w:szCs w:val="22"/>
               </w:rPr>
-              <w:t xml:space="preserve">Jul</w:t>
-            </w:r>
-          </w:p>
-        </w:tc>
-        <w:tc>
-          <w:tcPr>
-            <w:tcW w:type="dxa" w:w="1000"/>
+              <w:t xml:space="preserve">Mar</w:t>
+            </w:r>
+          </w:p>
+        </w:tc>
+        <w:tc>
+          <w:tcPr>
+            <w:tcW w:type="dxa" w:w="680"/>
             <w:shd w:fill="D9E1F2" w:val="clear"/>
             <w:tcMar>
               <w:top w:type="dxa" w:w="80"/>
@@ -2519,13 +2523,13 @@
                 <w:sz w:val="22"/>
                 <w:szCs w:val="22"/>
               </w:rPr>
-              <w:t xml:space="preserve">Ago</w:t>
-            </w:r>
-          </w:p>
-        </w:tc>
-        <w:tc>
-          <w:tcPr>
-            <w:tcW w:type="dxa" w:w="1000"/>
+              <w:t xml:space="preserve">Abr</w:t>
+            </w:r>
+          </w:p>
+        </w:tc>
+        <w:tc>
+          <w:tcPr>
+            <w:tcW w:type="dxa" w:w="680"/>
             <w:shd w:fill="D9E1F2" w:val="clear"/>
             <w:tcMar>
               <w:top w:type="dxa" w:w="80"/>
@@ -2546,13 +2550,13 @@
                 <w:sz w:val="22"/>
                 <w:szCs w:val="22"/>
               </w:rPr>
-              <w:t xml:space="preserve">Set</w:t>
-            </w:r>
-          </w:p>
-        </w:tc>
-        <w:tc>
-          <w:tcPr>
-            <w:tcW w:type="dxa" w:w="1000"/>
+              <w:t xml:space="preserve">Mai</w:t>
+            </w:r>
+          </w:p>
+        </w:tc>
+        <w:tc>
+          <w:tcPr>
+            <w:tcW w:type="dxa" w:w="680"/>
             <w:shd w:fill="D9E1F2" w:val="clear"/>
             <w:tcMar>
               <w:top w:type="dxa" w:w="80"/>
@@ -2573,13 +2577,13 @@
                 <w:sz w:val="22"/>
                 <w:szCs w:val="22"/>
               </w:rPr>
-              <w:t xml:space="preserve">Out</w:t>
-            </w:r>
-          </w:p>
-        </w:tc>
-        <w:tc>
-          <w:tcPr>
-            <w:tcW w:type="dxa" w:w="1000"/>
+              <w:t xml:space="preserve">Jun</w:t>
+            </w:r>
+          </w:p>
+        </w:tc>
+        <w:tc>
+          <w:tcPr>
+            <w:tcW w:type="dxa" w:w="680"/>
             <w:shd w:fill="D9E1F2" w:val="clear"/>
             <w:tcMar>
               <w:top w:type="dxa" w:w="80"/>
@@ -2600,13 +2604,13 @@
                 <w:sz w:val="22"/>
                 <w:szCs w:val="22"/>
               </w:rPr>
-              <w:t xml:space="preserve">Nov</w:t>
-            </w:r>
-          </w:p>
-        </w:tc>
-        <w:tc>
-          <w:tcPr>
-            <w:tcW w:type="dxa" w:w="1000"/>
+              <w:t xml:space="preserve">Jul</w:t>
+            </w:r>
+          </w:p>
+        </w:tc>
+        <w:tc>
+          <w:tcPr>
+            <w:tcW w:type="dxa" w:w="680"/>
             <w:shd w:fill="D9E1F2" w:val="clear"/>
             <w:tcMar>
               <w:top w:type="dxa" w:w="80"/>
@@ -2627,6 +2631,114 @@
                 <w:sz w:val="22"/>
                 <w:szCs w:val="22"/>
               </w:rPr>
+              <w:t xml:space="preserve">Ago</w:t>
+            </w:r>
+          </w:p>
+        </w:tc>
+        <w:tc>
+          <w:tcPr>
+            <w:tcW w:type="dxa" w:w="680"/>
+            <w:shd w:fill="D9E1F2" w:val="clear"/>
+            <w:tcMar>
+              <w:top w:type="dxa" w:w="80"/>
+              <w:left w:type="dxa" w:w="120"/>
+              <w:bottom w:type="dxa" w:w="80"/>
+              <w:right w:type="dxa" w:w="120"/>
+            </w:tcMar>
+          </w:tcPr>
+          <w:p>
+            <w:pPr>
+              <w:jc w:val="center"/>
+            </w:pPr>
+            <w:r>
+              <w:rPr>
+                <w:rFonts w:ascii="Arial" w:cs="Arial" w:eastAsia="Arial" w:hAnsi="Arial"/>
+                <w:b/>
+                <w:bCs/>
+                <w:sz w:val="22"/>
+                <w:szCs w:val="22"/>
+              </w:rPr>
+              <w:t xml:space="preserve">Set</w:t>
+            </w:r>
+          </w:p>
+        </w:tc>
+        <w:tc>
+          <w:tcPr>
+            <w:tcW w:type="dxa" w:w="680"/>
+            <w:shd w:fill="D9E1F2" w:val="clear"/>
+            <w:tcMar>
+              <w:top w:type="dxa" w:w="80"/>
+              <w:left w:type="dxa" w:w="120"/>
+              <w:bottom w:type="dxa" w:w="80"/>
+              <w:right w:type="dxa" w:w="120"/>
+            </w:tcMar>
+          </w:tcPr>
+          <w:p>
+            <w:pPr>
+              <w:jc w:val="center"/>
+            </w:pPr>
+            <w:r>
+              <w:rPr>
+                <w:rFonts w:ascii="Arial" w:cs="Arial" w:eastAsia="Arial" w:hAnsi="Arial"/>
+                <w:b/>
+                <w:bCs/>
+                <w:sz w:val="22"/>
+                <w:szCs w:val="22"/>
+              </w:rPr>
+              <w:t xml:space="preserve">Out</w:t>
+            </w:r>
+          </w:p>
+        </w:tc>
+        <w:tc>
+          <w:tcPr>
+            <w:tcW w:type="dxa" w:w="680"/>
+            <w:shd w:fill="D9E1F2" w:val="clear"/>
+            <w:tcMar>
+              <w:top w:type="dxa" w:w="80"/>
+              <w:left w:type="dxa" w:w="120"/>
+              <w:bottom w:type="dxa" w:w="80"/>
+              <w:right w:type="dxa" w:w="120"/>
+            </w:tcMar>
+          </w:tcPr>
+          <w:p>
+            <w:pPr>
+              <w:jc w:val="center"/>
+            </w:pPr>
+            <w:r>
+              <w:rPr>
+                <w:rFonts w:ascii="Arial" w:cs="Arial" w:eastAsia="Arial" w:hAnsi="Arial"/>
+                <w:b/>
+                <w:bCs/>
+                <w:sz w:val="22"/>
+                <w:szCs w:val="22"/>
+              </w:rPr>
+              <w:t xml:space="preserve">Nov</w:t>
+            </w:r>
+          </w:p>
+        </w:tc>
+        <w:tc>
+          <w:tcPr>
+            <w:tcW w:type="dxa" w:w="680"/>
+            <w:shd w:fill="D9E1F2" w:val="clear"/>
+            <w:tcMar>
+              <w:top w:type="dxa" w:w="80"/>
+              <w:left w:type="dxa" w:w="120"/>
+              <w:bottom w:type="dxa" w:w="80"/>
+              <w:right w:type="dxa" w:w="120"/>
+            </w:tcMar>
+          </w:tcPr>
+          <w:p>
+            <w:pPr>
+              <w:jc w:val="center"/>
+            </w:pPr>
+            <w:r>
+              <w:rPr>
+                <w:rFonts w:ascii="Arial" w:cs="Arial" w:eastAsia="Arial" w:hAnsi="Arial"/>
+                <w:b/>
+                <w:bCs/>
+                <w:sz w:val="22"/>
+                <w:szCs w:val="22"/>
+              </w:rPr>
               <w:t xml:space="preserve">Dez</w:t>
             </w:r>
           </w:p>
@@ -2635,7 +2747,7 @@
       <w:tr>
         <w:tc>
           <w:tcPr>
-            <w:tcW w:type="dxa" w:w="1071"/>
+            <w:tcW w:type="dxa" w:w="911"/>
             <w:tcMar>
               <w:top w:type="dxa" w:w="80"/>
               <w:left w:type="dxa" w:w="120"/>
@@ -2659,7 +2771,7 @@
         </w:tc>
         <w:tc>
           <w:tcPr>
-            <w:tcW w:type="dxa" w:w="1000"/>
+            <w:tcW w:type="dxa" w:w="680"/>
             <w:tcMar>
               <w:top w:type="dxa" w:w="80"/>
               <w:left w:type="dxa" w:w="120"/>
@@ -2683,7 +2795,31 @@
         </w:tc>
         <w:tc>
           <w:tcPr>
-            <w:tcW w:type="dxa" w:w="1000"/>
+            <w:tcW w:type="dxa" w:w="680"/>
+            <w:tcMar>
+              <w:top w:type="dxa" w:w="80"/>
+              <w:left w:type="dxa" w:w="120"/>
+              <w:bottom w:type="dxa" w:w="80"/>
+              <w:right w:type="dxa" w:w="120"/>
+            </w:tcMar>
+          </w:tcPr>
+          <w:p>
+            <w:pPr>
+              <w:jc w:val="center"/>
+            </w:pPr>
+            <w:r>
+              <w:rPr>
+                <w:rFonts w:ascii="Arial" w:cs="Arial" w:eastAsia="Arial" w:hAnsi="Arial"/>
+                <w:sz w:val="22"/>
+                <w:szCs w:val="22"/>
+              </w:rPr>
+              <w:t xml:space="preserve">●</w:t>
+            </w:r>
+          </w:p>
+        </w:tc>
+        <w:tc>
+          <w:tcPr>
+            <w:tcW w:type="dxa" w:w="680"/>
             <w:tcMar>
               <w:top w:type="dxa" w:w="80"/>
               <w:left w:type="dxa" w:w="120"/>
@@ -2707,7 +2843,7 @@
         </w:tc>
         <w:tc>
           <w:tcPr>
-            <w:tcW w:type="dxa" w:w="1000"/>
+            <w:tcW w:type="dxa" w:w="680"/>
             <w:tcMar>
               <w:top w:type="dxa" w:w="80"/>
               <w:left w:type="dxa" w:w="120"/>
@@ -2731,7 +2867,7 @@
         </w:tc>
         <w:tc>
           <w:tcPr>
-            <w:tcW w:type="dxa" w:w="1000"/>
+            <w:tcW w:type="dxa" w:w="680"/>
             <w:tcMar>
               <w:top w:type="dxa" w:w="80"/>
               <w:left w:type="dxa" w:w="120"/>
@@ -2755,7 +2891,7 @@
         </w:tc>
         <w:tc>
           <w:tcPr>
-            <w:tcW w:type="dxa" w:w="1000"/>
+            <w:tcW w:type="dxa" w:w="680"/>
             <w:tcMar>
               <w:top w:type="dxa" w:w="80"/>
               <w:left w:type="dxa" w:w="120"/>
@@ -2779,7 +2915,7 @@
         </w:tc>
         <w:tc>
           <w:tcPr>
-            <w:tcW w:type="dxa" w:w="1000"/>
+            <w:tcW w:type="dxa" w:w="680"/>
             <w:tcMar>
               <w:top w:type="dxa" w:w="80"/>
               <w:left w:type="dxa" w:w="120"/>
@@ -2803,7 +2939,7 @@
         </w:tc>
         <w:tc>
           <w:tcPr>
-            <w:tcW w:type="dxa" w:w="1000"/>
+            <w:tcW w:type="dxa" w:w="680"/>
             <w:tcMar>
               <w:top w:type="dxa" w:w="80"/>
               <w:left w:type="dxa" w:w="120"/>
@@ -2827,7 +2963,79 @@
         </w:tc>
         <w:tc>
           <w:tcPr>
-            <w:tcW w:type="dxa" w:w="1000"/>
+            <w:tcW w:type="dxa" w:w="680"/>
+            <w:tcMar>
+              <w:top w:type="dxa" w:w="80"/>
+              <w:left w:type="dxa" w:w="120"/>
+              <w:bottom w:type="dxa" w:w="80"/>
+              <w:right w:type="dxa" w:w="120"/>
+            </w:tcMar>
+          </w:tcPr>
+          <w:p>
+            <w:pPr>
+              <w:jc w:val="center"/>
+            </w:pPr>
+            <w:r>
+              <w:rPr>
+                <w:rFonts w:ascii="Arial" w:cs="Arial" w:eastAsia="Arial" w:hAnsi="Arial"/>
+                <w:sz w:val="22"/>
+                <w:szCs w:val="22"/>
+              </w:rPr>
+              <w:t xml:space="preserve"/>
+            </w:r>
+          </w:p>
+        </w:tc>
+        <w:tc>
+          <w:tcPr>
+            <w:tcW w:type="dxa" w:w="680"/>
+            <w:tcMar>
+              <w:top w:type="dxa" w:w="80"/>
+              <w:left w:type="dxa" w:w="120"/>
+              <w:bottom w:type="dxa" w:w="80"/>
+              <w:right w:type="dxa" w:w="120"/>
+            </w:tcMar>
+          </w:tcPr>
+          <w:p>
+            <w:pPr>
+              <w:jc w:val="center"/>
+            </w:pPr>
+            <w:r>
+              <w:rPr>
+                <w:rFonts w:ascii="Arial" w:cs="Arial" w:eastAsia="Arial" w:hAnsi="Arial"/>
+                <w:sz w:val="22"/>
+                <w:szCs w:val="22"/>
+              </w:rPr>
+              <w:t xml:space="preserve"/>
+            </w:r>
+          </w:p>
+        </w:tc>
+        <w:tc>
+          <w:tcPr>
+            <w:tcW w:type="dxa" w:w="680"/>
+            <w:tcMar>
+              <w:top w:type="dxa" w:w="80"/>
+              <w:left w:type="dxa" w:w="120"/>
+              <w:bottom w:type="dxa" w:w="80"/>
+              <w:right w:type="dxa" w:w="120"/>
+            </w:tcMar>
+          </w:tcPr>
+          <w:p>
+            <w:pPr>
+              <w:jc w:val="center"/>
+            </w:pPr>
+            <w:r>
+              <w:rPr>
+                <w:rFonts w:ascii="Arial" w:cs="Arial" w:eastAsia="Arial" w:hAnsi="Arial"/>
+                <w:sz w:val="22"/>
+                <w:szCs w:val="22"/>
+              </w:rPr>
+              <w:t xml:space="preserve"/>
+            </w:r>
+          </w:p>
+        </w:tc>
+        <w:tc>
+          <w:tcPr>
+            <w:tcW w:type="dxa" w:w="680"/>
             <w:tcMar>
               <w:top w:type="dxa" w:w="80"/>
               <w:left w:type="dxa" w:w="120"/>
@@ -2853,7 +3061,7 @@
       <w:tr>
         <w:tc>
           <w:tcPr>
-            <w:tcW w:type="dxa" w:w="1071"/>
+            <w:tcW w:type="dxa" w:w="911"/>
             <w:tcMar>
               <w:top w:type="dxa" w:w="80"/>
               <w:left w:type="dxa" w:w="120"/>
@@ -2877,7 +3085,55 @@
         </w:tc>
         <w:tc>
           <w:tcPr>
-            <w:tcW w:type="dxa" w:w="1000"/>
+            <w:tcW w:type="dxa" w:w="680"/>
+            <w:tcMar>
+              <w:top w:type="dxa" w:w="80"/>
+              <w:left w:type="dxa" w:w="120"/>
+              <w:bottom w:type="dxa" w:w="80"/>
+              <w:right w:type="dxa" w:w="120"/>
+            </w:tcMar>
+          </w:tcPr>
+          <w:p>
+            <w:pPr>
+              <w:jc w:val="center"/>
+            </w:pPr>
+            <w:r>
+              <w:rPr>
+                <w:rFonts w:ascii="Arial" w:cs="Arial" w:eastAsia="Arial" w:hAnsi="Arial"/>
+                <w:sz w:val="22"/>
+                <w:szCs w:val="22"/>
+              </w:rPr>
+              <w:t xml:space="preserve"/>
+            </w:r>
+          </w:p>
+        </w:tc>
+        <w:tc>
+          <w:tcPr>
+            <w:tcW w:type="dxa" w:w="680"/>
+            <w:tcMar>
+              <w:top w:type="dxa" w:w="80"/>
+              <w:left w:type="dxa" w:w="120"/>
+              <w:bottom w:type="dxa" w:w="80"/>
+              <w:right w:type="dxa" w:w="120"/>
+            </w:tcMar>
+          </w:tcPr>
+          <w:p>
+            <w:pPr>
+              <w:jc w:val="center"/>
+            </w:pPr>
+            <w:r>
+              <w:rPr>
+                <w:rFonts w:ascii="Arial" w:cs="Arial" w:eastAsia="Arial" w:hAnsi="Arial"/>
+                <w:sz w:val="22"/>
+                <w:szCs w:val="22"/>
+              </w:rPr>
+              <w:t xml:space="preserve"/>
+            </w:r>
+          </w:p>
+        </w:tc>
+        <w:tc>
+          <w:tcPr>
+            <w:tcW w:type="dxa" w:w="680"/>
             <w:tcMar>
               <w:top w:type="dxa" w:w="80"/>
               <w:left w:type="dxa" w:w="120"/>
@@ -2901,7 +3157,7 @@
         </w:tc>
         <w:tc>
           <w:tcPr>
-            <w:tcW w:type="dxa" w:w="1000"/>
+            <w:tcW w:type="dxa" w:w="680"/>
             <w:tcMar>
               <w:top w:type="dxa" w:w="80"/>
               <w:left w:type="dxa" w:w="120"/>
@@ -2925,7 +3181,7 @@
         </w:tc>
         <w:tc>
           <w:tcPr>
-            <w:tcW w:type="dxa" w:w="1000"/>
+            <w:tcW w:type="dxa" w:w="680"/>
             <w:tcMar>
               <w:top w:type="dxa" w:w="80"/>
               <w:left w:type="dxa" w:w="120"/>
@@ -2949,7 +3205,7 @@
         </w:tc>
         <w:tc>
           <w:tcPr>
-            <w:tcW w:type="dxa" w:w="1000"/>
+            <w:tcW w:type="dxa" w:w="680"/>
             <w:tcMar>
               <w:top w:type="dxa" w:w="80"/>
               <w:left w:type="dxa" w:w="120"/>
@@ -2973,7 +3229,7 @@
         </w:tc>
         <w:tc>
           <w:tcPr>
-            <w:tcW w:type="dxa" w:w="1000"/>
+            <w:tcW w:type="dxa" w:w="680"/>
             <w:tcMar>
               <w:top w:type="dxa" w:w="80"/>
               <w:left w:type="dxa" w:w="120"/>
@@ -2997,7 +3253,7 @@
         </w:tc>
         <w:tc>
           <w:tcPr>
-            <w:tcW w:type="dxa" w:w="1000"/>
+            <w:tcW w:type="dxa" w:w="680"/>
             <w:tcMar>
               <w:top w:type="dxa" w:w="80"/>
               <w:left w:type="dxa" w:w="120"/>
@@ -3021,7 +3277,7 @@
         </w:tc>
         <w:tc>
           <w:tcPr>
-            <w:tcW w:type="dxa" w:w="1000"/>
+            <w:tcW w:type="dxa" w:w="680"/>
             <w:tcMar>
               <w:top w:type="dxa" w:w="80"/>
               <w:left w:type="dxa" w:w="120"/>
@@ -3045,7 +3301,55 @@
         </w:tc>
         <w:tc>
           <w:tcPr>
-            <w:tcW w:type="dxa" w:w="1000"/>
+            <w:tcW w:type="dxa" w:w="680"/>
+            <w:tcMar>
+              <w:top w:type="dxa" w:w="80"/>
+              <w:left w:type="dxa" w:w="120"/>
+              <w:bottom w:type="dxa" w:w="80"/>
+              <w:right w:type="dxa" w:w="120"/>
+            </w:tcMar>
+          </w:tcPr>
+          <w:p>
+            <w:pPr>
+              <w:jc w:val="center"/>
+            </w:pPr>
+            <w:r>
+              <w:rPr>
+                <w:rFonts w:ascii="Arial" w:cs="Arial" w:eastAsia="Arial" w:hAnsi="Arial"/>
+                <w:sz w:val="22"/>
+                <w:szCs w:val="22"/>
+              </w:rPr>
+              <w:t xml:space="preserve"/>
+            </w:r>
+          </w:p>
+        </w:tc>
+        <w:tc>
+          <w:tcPr>
+            <w:tcW w:type="dxa" w:w="680"/>
+            <w:tcMar>
+              <w:top w:type="dxa" w:w="80"/>
+              <w:left w:type="dxa" w:w="120"/>
+              <w:bottom w:type="dxa" w:w="80"/>
+              <w:right w:type="dxa" w:w="120"/>
+            </w:tcMar>
+          </w:tcPr>
+          <w:p>
+            <w:pPr>
+              <w:jc w:val="center"/>
+            </w:pPr>
+            <w:r>
+              <w:rPr>
+                <w:rFonts w:ascii="Arial" w:cs="Arial" w:eastAsia="Arial" w:hAnsi="Arial"/>
+                <w:sz w:val="22"/>
+                <w:szCs w:val="22"/>
+              </w:rPr>
+              <w:t xml:space="preserve"/>
+            </w:r>
+          </w:p>
+        </w:tc>
+        <w:tc>
+          <w:tcPr>
+            <w:tcW w:type="dxa" w:w="680"/>
             <w:tcMar>
               <w:top w:type="dxa" w:w="80"/>
               <w:left w:type="dxa" w:w="120"/>
@@ -3071,7 +3375,7 @@
       <w:tr>
         <w:tc>
           <w:tcPr>
-            <w:tcW w:type="dxa" w:w="1071"/>
+            <w:tcW w:type="dxa" w:w="911"/>
             <w:tcMar>
               <w:top w:type="dxa" w:w="80"/>
               <w:left w:type="dxa" w:w="120"/>
@@ -3095,7 +3399,7 @@
         </w:tc>
         <w:tc>
           <w:tcPr>
-            <w:tcW w:type="dxa" w:w="1000"/>
+            <w:tcW w:type="dxa" w:w="680"/>
             <w:tcMar>
               <w:top w:type="dxa" w:w="80"/>
               <w:left w:type="dxa" w:w="120"/>
@@ -3119,7 +3423,7 @@
         </w:tc>
         <w:tc>
           <w:tcPr>
-            <w:tcW w:type="dxa" w:w="1000"/>
+            <w:tcW w:type="dxa" w:w="680"/>
             <w:tcMar>
               <w:top w:type="dxa" w:w="80"/>
               <w:left w:type="dxa" w:w="120"/>
@@ -3143,7 +3447,55 @@
         </w:tc>
         <w:tc>
           <w:tcPr>
-            <w:tcW w:type="dxa" w:w="1000"/>
+            <w:tcW w:type="dxa" w:w="680"/>
+            <w:tcMar>
+              <w:top w:type="dxa" w:w="80"/>
+              <w:left w:type="dxa" w:w="120"/>
+              <w:bottom w:type="dxa" w:w="80"/>
+              <w:right w:type="dxa" w:w="120"/>
+            </w:tcMar>
+          </w:tcPr>
+          <w:p>
+            <w:pPr>
+              <w:jc w:val="center"/>
+            </w:pPr>
+            <w:r>
+              <w:rPr>
+                <w:rFonts w:ascii="Arial" w:cs="Arial" w:eastAsia="Arial" w:hAnsi="Arial"/>
+                <w:sz w:val="22"/>
+                <w:szCs w:val="22"/>
+              </w:rPr>
+              <w:t xml:space="preserve"/>
+            </w:r>
+          </w:p>
+        </w:tc>
+        <w:tc>
+          <w:tcPr>
+            <w:tcW w:type="dxa" w:w="680"/>
+            <w:tcMar>
+              <w:top w:type="dxa" w:w="80"/>
+              <w:left w:type="dxa" w:w="120"/>
+              <w:bottom w:type="dxa" w:w="80"/>
+              <w:right w:type="dxa" w:w="120"/>
+            </w:tcMar>
+          </w:tcPr>
+          <w:p>
+            <w:pPr>
+              <w:jc w:val="center"/>
+            </w:pPr>
+            <w:r>
+              <w:rPr>
+                <w:rFonts w:ascii="Arial" w:cs="Arial" w:eastAsia="Arial" w:hAnsi="Arial"/>
+                <w:sz w:val="22"/>
+                <w:szCs w:val="22"/>
+              </w:rPr>
+              <w:t xml:space="preserve"/>
+            </w:r>
+          </w:p>
+        </w:tc>
+        <w:tc>
+          <w:tcPr>
+            <w:tcW w:type="dxa" w:w="680"/>
             <w:tcMar>
               <w:top w:type="dxa" w:w="80"/>
               <w:left w:type="dxa" w:w="120"/>
@@ -3167,7 +3519,31 @@
         </w:tc>
         <w:tc>
           <w:tcPr>
-            <w:tcW w:type="dxa" w:w="1000"/>
+            <w:tcW w:type="dxa" w:w="680"/>
+            <w:tcMar>
+              <w:top w:type="dxa" w:w="80"/>
+              <w:left w:type="dxa" w:w="120"/>
+              <w:bottom w:type="dxa" w:w="80"/>
+              <w:right w:type="dxa" w:w="120"/>
+            </w:tcMar>
+          </w:tcPr>
+          <w:p>
+            <w:pPr>
+              <w:jc w:val="center"/>
+            </w:pPr>
+            <w:r>
+              <w:rPr>
+                <w:rFonts w:ascii="Arial" w:cs="Arial" w:eastAsia="Arial" w:hAnsi="Arial"/>
+                <w:sz w:val="22"/>
+                <w:szCs w:val="22"/>
+              </w:rPr>
+              <w:t xml:space="preserve">●</w:t>
+            </w:r>
+          </w:p>
+        </w:tc>
+        <w:tc>
+          <w:tcPr>
+            <w:tcW w:type="dxa" w:w="680"/>
             <w:tcMar>
               <w:top w:type="dxa" w:w="80"/>
               <w:left w:type="dxa" w:w="120"/>
@@ -3191,7 +3567,7 @@
         </w:tc>
         <w:tc>
           <w:tcPr>
-            <w:tcW w:type="dxa" w:w="1000"/>
+            <w:tcW w:type="dxa" w:w="680"/>
             <w:tcMar>
               <w:top w:type="dxa" w:w="80"/>
               <w:left w:type="dxa" w:w="120"/>
@@ -3215,7 +3591,7 @@
         </w:tc>
         <w:tc>
           <w:tcPr>
-            <w:tcW w:type="dxa" w:w="1000"/>
+            <w:tcW w:type="dxa" w:w="680"/>
             <w:tcMar>
               <w:top w:type="dxa" w:w="80"/>
               <w:left w:type="dxa" w:w="120"/>
@@ -3239,7 +3615,7 @@
         </w:tc>
         <w:tc>
           <w:tcPr>
-            <w:tcW w:type="dxa" w:w="1000"/>
+            <w:tcW w:type="dxa" w:w="680"/>
             <w:tcMar>
               <w:top w:type="dxa" w:w="80"/>
               <w:left w:type="dxa" w:w="120"/>
@@ -3263,7 +3639,31 @@
         </w:tc>
         <w:tc>
           <w:tcPr>
-            <w:tcW w:type="dxa" w:w="1000"/>
+            <w:tcW w:type="dxa" w:w="680"/>
+            <w:tcMar>
+              <w:top w:type="dxa" w:w="80"/>
+              <w:left w:type="dxa" w:w="120"/>
+              <w:bottom w:type="dxa" w:w="80"/>
+              <w:right w:type="dxa" w:w="120"/>
+            </w:tcMar>
+          </w:tcPr>
+          <w:p>
+            <w:pPr>
+              <w:jc w:val="center"/>
+            </w:pPr>
+            <w:r>
+              <w:rPr>
+                <w:rFonts w:ascii="Arial" w:cs="Arial" w:eastAsia="Arial" w:hAnsi="Arial"/>
+                <w:sz w:val="22"/>
+                <w:szCs w:val="22"/>
+              </w:rPr>
+              <w:t xml:space="preserve"/>
+            </w:r>
+          </w:p>
+        </w:tc>
+        <w:tc>
+          <w:tcPr>
+            <w:tcW w:type="dxa" w:w="680"/>
             <w:tcMar>
               <w:top w:type="dxa" w:w="80"/>
               <w:left w:type="dxa" w:w="120"/>
@@ -3289,7 +3689,7 @@
       <w:tr>
         <w:tc>
           <w:tcPr>
-            <w:tcW w:type="dxa" w:w="1071"/>
+            <w:tcW w:type="dxa" w:w="911"/>
             <w:tcMar>
               <w:top w:type="dxa" w:w="80"/>
               <w:left w:type="dxa" w:w="120"/>
@@ -3313,7 +3713,7 @@
         </w:tc>
         <w:tc>
           <w:tcPr>
-            <w:tcW w:type="dxa" w:w="1000"/>
+            <w:tcW w:type="dxa" w:w="680"/>
             <w:tcMar>
               <w:top w:type="dxa" w:w="80"/>
               <w:left w:type="dxa" w:w="120"/>
@@ -3337,7 +3737,7 @@
         </w:tc>
         <w:tc>
           <w:tcPr>
-            <w:tcW w:type="dxa" w:w="1000"/>
+            <w:tcW w:type="dxa" w:w="680"/>
             <w:tcMar>
               <w:top w:type="dxa" w:w="80"/>
               <w:left w:type="dxa" w:w="120"/>
@@ -3361,7 +3761,7 @@
         </w:tc>
         <w:tc>
           <w:tcPr>
-            <w:tcW w:type="dxa" w:w="1000"/>
+            <w:tcW w:type="dxa" w:w="680"/>
             <w:tcMar>
               <w:top w:type="dxa" w:w="80"/>
               <w:left w:type="dxa" w:w="120"/>
@@ -3385,7 +3785,79 @@
         </w:tc>
         <w:tc>
           <w:tcPr>
-            <w:tcW w:type="dxa" w:w="1000"/>
+            <w:tcW w:type="dxa" w:w="680"/>
+            <w:tcMar>
+              <w:top w:type="dxa" w:w="80"/>
+              <w:left w:type="dxa" w:w="120"/>
+              <w:bottom w:type="dxa" w:w="80"/>
+              <w:right w:type="dxa" w:w="120"/>
+            </w:tcMar>
+          </w:tcPr>
+          <w:p>
+            <w:pPr>
+              <w:jc w:val="center"/>
+            </w:pPr>
+            <w:r>
+              <w:rPr>
+                <w:rFonts w:ascii="Arial" w:cs="Arial" w:eastAsia="Arial" w:hAnsi="Arial"/>
+                <w:sz w:val="22"/>
+                <w:szCs w:val="22"/>
+              </w:rPr>
+              <w:t xml:space="preserve"/>
+            </w:r>
+          </w:p>
+        </w:tc>
+        <w:tc>
+          <w:tcPr>
+            <w:tcW w:type="dxa" w:w="680"/>
+            <w:tcMar>
+              <w:top w:type="dxa" w:w="80"/>
+              <w:left w:type="dxa" w:w="120"/>
+              <w:bottom w:type="dxa" w:w="80"/>
+              <w:right w:type="dxa" w:w="120"/>
+            </w:tcMar>
+          </w:tcPr>
+          <w:p>
+            <w:pPr>
+              <w:jc w:val="center"/>
+            </w:pPr>
+            <w:r>
+              <w:rPr>
+                <w:rFonts w:ascii="Arial" w:cs="Arial" w:eastAsia="Arial" w:hAnsi="Arial"/>
+                <w:sz w:val="22"/>
+                <w:szCs w:val="22"/>
+              </w:rPr>
+              <w:t xml:space="preserve"/>
+            </w:r>
+          </w:p>
+        </w:tc>
+        <w:tc>
+          <w:tcPr>
+            <w:tcW w:type="dxa" w:w="680"/>
+            <w:tcMar>
+              <w:top w:type="dxa" w:w="80"/>
+              <w:left w:type="dxa" w:w="120"/>
+              <w:bottom w:type="dxa" w:w="80"/>
+              <w:right w:type="dxa" w:w="120"/>
+            </w:tcMar>
+          </w:tcPr>
+          <w:p>
+            <w:pPr>
+              <w:jc w:val="center"/>
+            </w:pPr>
+            <w:r>
+              <w:rPr>
+                <w:rFonts w:ascii="Arial" w:cs="Arial" w:eastAsia="Arial" w:hAnsi="Arial"/>
+                <w:sz w:val="22"/>
+                <w:szCs w:val="22"/>
+              </w:rPr>
+              <w:t xml:space="preserve"/>
+            </w:r>
+          </w:p>
+        </w:tc>
+        <w:tc>
+          <w:tcPr>
+            <w:tcW w:type="dxa" w:w="680"/>
             <w:tcMar>
               <w:top w:type="dxa" w:w="80"/>
               <w:left w:type="dxa" w:w="120"/>
@@ -3409,7 +3881,7 @@
         </w:tc>
         <w:tc>
           <w:tcPr>
-            <w:tcW w:type="dxa" w:w="1000"/>
+            <w:tcW w:type="dxa" w:w="680"/>
             <w:tcMar>
               <w:top w:type="dxa" w:w="80"/>
               <w:left w:type="dxa" w:w="120"/>
@@ -3433,7 +3905,7 @@
         </w:tc>
         <w:tc>
           <w:tcPr>
-            <w:tcW w:type="dxa" w:w="1000"/>
+            <w:tcW w:type="dxa" w:w="680"/>
             <w:tcMar>
               <w:top w:type="dxa" w:w="80"/>
               <w:left w:type="dxa" w:w="120"/>
@@ -3457,7 +3929,7 @@
         </w:tc>
         <w:tc>
           <w:tcPr>
-            <w:tcW w:type="dxa" w:w="1000"/>
+            <w:tcW w:type="dxa" w:w="680"/>
             <w:tcMar>
               <w:top w:type="dxa" w:w="80"/>
               <w:left w:type="dxa" w:w="120"/>
@@ -3481,7 +3953,31 @@
         </w:tc>
         <w:tc>
           <w:tcPr>
-            <w:tcW w:type="dxa" w:w="1000"/>
+            <w:tcW w:type="dxa" w:w="680"/>
+            <w:tcMar>
+              <w:top w:type="dxa" w:w="80"/>
+              <w:left w:type="dxa" w:w="120"/>
+              <w:bottom w:type="dxa" w:w="80"/>
+              <w:right w:type="dxa" w:w="120"/>
+            </w:tcMar>
+          </w:tcPr>
+          <w:p>
+            <w:pPr>
+              <w:jc w:val="center"/>
+            </w:pPr>
+            <w:r>
+              <w:rPr>
+                <w:rFonts w:ascii="Arial" w:cs="Arial" w:eastAsia="Arial" w:hAnsi="Arial"/>
+                <w:sz w:val="22"/>
+                <w:szCs w:val="22"/>
+              </w:rPr>
+              <w:t xml:space="preserve"/>
+            </w:r>
+          </w:p>
+        </w:tc>
+        <w:tc>
+          <w:tcPr>
+            <w:tcW w:type="dxa" w:w="680"/>
             <w:tcMar>
               <w:top w:type="dxa" w:w="80"/>
               <w:left w:type="dxa" w:w="120"/>
@@ -3507,7 +4003,7 @@
       <w:tr>
         <w:tc>
           <w:tcPr>
-            <w:tcW w:type="dxa" w:w="1071"/>
+            <w:tcW w:type="dxa" w:w="911"/>
             <w:tcMar>
               <w:top w:type="dxa" w:w="80"/>
               <w:left w:type="dxa" w:w="120"/>
@@ -3531,7 +4027,7 @@
         </w:tc>
         <w:tc>
           <w:tcPr>
-            <w:tcW w:type="dxa" w:w="1000"/>
+            <w:tcW w:type="dxa" w:w="680"/>
             <w:tcMar>
               <w:top w:type="dxa" w:w="80"/>
               <w:left w:type="dxa" w:w="120"/>
@@ -3555,7 +4051,7 @@
         </w:tc>
         <w:tc>
           <w:tcPr>
-            <w:tcW w:type="dxa" w:w="1000"/>
+            <w:tcW w:type="dxa" w:w="680"/>
             <w:tcMar>
               <w:top w:type="dxa" w:w="80"/>
               <w:left w:type="dxa" w:w="120"/>
@@ -3579,7 +4075,7 @@
         </w:tc>
         <w:tc>
           <w:tcPr>
-            <w:tcW w:type="dxa" w:w="1000"/>
+            <w:tcW w:type="dxa" w:w="680"/>
             <w:tcMar>
               <w:top w:type="dxa" w:w="80"/>
               <w:left w:type="dxa" w:w="120"/>
@@ -3603,7 +4099,7 @@
         </w:tc>
         <w:tc>
           <w:tcPr>
-            <w:tcW w:type="dxa" w:w="1000"/>
+            <w:tcW w:type="dxa" w:w="680"/>
             <w:tcMar>
               <w:top w:type="dxa" w:w="80"/>
               <w:left w:type="dxa" w:w="120"/>
@@ -3627,7 +4123,7 @@
         </w:tc>
         <w:tc>
           <w:tcPr>
-            <w:tcW w:type="dxa" w:w="1000"/>
+            <w:tcW w:type="dxa" w:w="680"/>
             <w:tcMar>
               <w:top w:type="dxa" w:w="80"/>
               <w:left w:type="dxa" w:w="120"/>
@@ -3651,7 +4147,7 @@
         </w:tc>
         <w:tc>
           <w:tcPr>
-            <w:tcW w:type="dxa" w:w="1000"/>
+            <w:tcW w:type="dxa" w:w="680"/>
             <w:tcMar>
               <w:top w:type="dxa" w:w="80"/>
               <w:left w:type="dxa" w:w="120"/>
@@ -3675,7 +4171,79 @@
         </w:tc>
         <w:tc>
           <w:tcPr>
-            <w:tcW w:type="dxa" w:w="1000"/>
+            <w:tcW w:type="dxa" w:w="680"/>
+            <w:tcMar>
+              <w:top w:type="dxa" w:w="80"/>
+              <w:left w:type="dxa" w:w="120"/>
+              <w:bottom w:type="dxa" w:w="80"/>
+              <w:right w:type="dxa" w:w="120"/>
+            </w:tcMar>
+          </w:tcPr>
+          <w:p>
+            <w:pPr>
+              <w:jc w:val="center"/>
+            </w:pPr>
+            <w:r>
+              <w:rPr>
+                <w:rFonts w:ascii="Arial" w:cs="Arial" w:eastAsia="Arial" w:hAnsi="Arial"/>
+                <w:sz w:val="22"/>
+                <w:szCs w:val="22"/>
+              </w:rPr>
+              <w:t xml:space="preserve"/>
+            </w:r>
+          </w:p>
+        </w:tc>
+        <w:tc>
+          <w:tcPr>
+            <w:tcW w:type="dxa" w:w="680"/>
+            <w:tcMar>
+              <w:top w:type="dxa" w:w="80"/>
+              <w:left w:type="dxa" w:w="120"/>
+              <w:bottom w:type="dxa" w:w="80"/>
+              <w:right w:type="dxa" w:w="120"/>
+            </w:tcMar>
+          </w:tcPr>
+          <w:p>
+            <w:pPr>
+              <w:jc w:val="center"/>
+            </w:pPr>
+            <w:r>
+              <w:rPr>
+                <w:rFonts w:ascii="Arial" w:cs="Arial" w:eastAsia="Arial" w:hAnsi="Arial"/>
+                <w:sz w:val="22"/>
+                <w:szCs w:val="22"/>
+              </w:rPr>
+              <w:t xml:space="preserve"/>
+            </w:r>
+          </w:p>
+        </w:tc>
+        <w:tc>
+          <w:tcPr>
+            <w:tcW w:type="dxa" w:w="680"/>
+            <w:tcMar>
+              <w:top w:type="dxa" w:w="80"/>
+              <w:left w:type="dxa" w:w="120"/>
+              <w:bottom w:type="dxa" w:w="80"/>
+              <w:right w:type="dxa" w:w="120"/>
+            </w:tcMar>
+          </w:tcPr>
+          <w:p>
+            <w:pPr>
+              <w:jc w:val="center"/>
+            </w:pPr>
+            <w:r>
+              <w:rPr>
+                <w:rFonts w:ascii="Arial" w:cs="Arial" w:eastAsia="Arial" w:hAnsi="Arial"/>
+                <w:sz w:val="22"/>
+                <w:szCs w:val="22"/>
+              </w:rPr>
+              <w:t xml:space="preserve"/>
+            </w:r>
+          </w:p>
+        </w:tc>
+        <w:tc>
+          <w:tcPr>
+            <w:tcW w:type="dxa" w:w="680"/>
             <w:tcMar>
               <w:top w:type="dxa" w:w="80"/>
               <w:left w:type="dxa" w:w="120"/>
@@ -3699,7 +4267,31 @@
         </w:tc>
         <w:tc>
           <w:tcPr>
-            <w:tcW w:type="dxa" w:w="1000"/>
+            <w:tcW w:type="dxa" w:w="680"/>
+            <w:tcMar>
+              <w:top w:type="dxa" w:w="80"/>
+              <w:left w:type="dxa" w:w="120"/>
+              <w:bottom w:type="dxa" w:w="80"/>
+              <w:right w:type="dxa" w:w="120"/>
+            </w:tcMar>
+          </w:tcPr>
+          <w:p>
+            <w:pPr>
+              <w:jc w:val="center"/>
+            </w:pPr>
+            <w:r>
+              <w:rPr>
+                <w:rFonts w:ascii="Arial" w:cs="Arial" w:eastAsia="Arial" w:hAnsi="Arial"/>
+                <w:sz w:val="22"/>
+                <w:szCs w:val="22"/>
+              </w:rPr>
+              <w:t xml:space="preserve">●</w:t>
+            </w:r>
+          </w:p>
+        </w:tc>
+        <w:tc>
+          <w:tcPr>
+            <w:tcW w:type="dxa" w:w="680"/>
             <w:tcMar>
               <w:top w:type="dxa" w:w="80"/>
               <w:left w:type="dxa" w:w="120"/>

</xml_diff>